<commit_message>
Recette 2026-04-20 12:05 — 0 ok / 0 ko
</commit_message>
<xml_diff>
--- a/results/recette-lam.docx
+++ b/results/recette-lam.docx
@@ -339,7 +339,7 @@
                 <w:sz w:val="20"/>
                 <w:szCs w:val="20"/>
               </w:rPr>
-              <w:t xml:space="preserve">20/04/2026 à 11:56:38</w:t>
+              <w:t xml:space="preserve">20/04/2026 à 12:05:15</w:t>
             </w:r>
           </w:p>
         </w:tc>
@@ -382,16 +382,15 @@
         </w:tblBorders>
       </w:tblPr>
       <w:tblGrid>
-        <w:gridCol w:w="2400"/>
-        <w:gridCol w:w="700"/>
-        <w:gridCol w:w="4326"/>
-        <w:gridCol w:w="700"/>
-        <w:gridCol w:w="900"/>
+        <w:gridCol w:w="2600"/>
+        <w:gridCol w:w="800"/>
+        <w:gridCol w:w="4826"/>
+        <w:gridCol w:w="800"/>
       </w:tblGrid>
       <w:tr>
         <w:tc>
           <w:tcPr>
-            <w:tcW w:type="dxa" w:w="2400"/>
+            <w:tcW w:type="dxa" w:w="2600"/>
             <w:tcBorders>
               <w:top w:val="single" w:color="CCCCCC" w:sz="4"/>
               <w:left w:val="single" w:color="CCCCCC" w:sz="4"/>
@@ -423,7 +422,7 @@
         </w:tc>
         <w:tc>
           <w:tcPr>
-            <w:tcW w:type="dxa" w:w="700"/>
+            <w:tcW w:type="dxa" w:w="800"/>
             <w:tcBorders>
               <w:top w:val="single" w:color="CCCCCC" w:sz="4"/>
               <w:left w:val="single" w:color="CCCCCC" w:sz="4"/>
@@ -455,7 +454,7 @@
         </w:tc>
         <w:tc>
           <w:tcPr>
-            <w:tcW w:type="dxa" w:w="4326"/>
+            <w:tcW w:type="dxa" w:w="4826"/>
             <w:tcBorders>
               <w:top w:val="single" w:color="CCCCCC" w:sz="4"/>
               <w:left w:val="single" w:color="CCCCCC" w:sz="4"/>
@@ -487,7 +486,7 @@
         </w:tc>
         <w:tc>
           <w:tcPr>
-            <w:tcW w:type="dxa" w:w="700"/>
+            <w:tcW w:type="dxa" w:w="800"/>
             <w:tcBorders>
               <w:top w:val="single" w:color="CCCCCC" w:sz="4"/>
               <w:left w:val="single" w:color="CCCCCC" w:sz="4"/>
@@ -517,43 +516,11 @@
             </w:r>
           </w:p>
         </w:tc>
-        <w:tc>
-          <w:tcPr>
-            <w:tcW w:type="dxa" w:w="900"/>
-            <w:tcBorders>
-              <w:top w:val="single" w:color="CCCCCC" w:sz="4"/>
-              <w:left w:val="single" w:color="CCCCCC" w:sz="4"/>
-              <w:bottom w:val="single" w:color="CCCCCC" w:sz="4"/>
-              <w:right w:val="single" w:color="CCCCCC" w:sz="4"/>
-            </w:tcBorders>
-            <w:shd w:fill="004A9F" w:val="clear"/>
-            <w:tcMar>
-              <w:top w:type="dxa" w:w="80"/>
-              <w:left w:type="dxa" w:w="120"/>
-              <w:bottom w:type="dxa" w:w="80"/>
-              <w:right w:type="dxa" w:w="120"/>
-            </w:tcMar>
-            <w:vAlign w:val="center"/>
-          </w:tcPr>
-          <w:p>
-            <w:r>
-              <w:rPr>
-                <w:rFonts w:ascii="Tw Cen MT" w:cs="Tw Cen MT" w:eastAsia="Tw Cen MT" w:hAnsi="Tw Cen MT"/>
-                <w:b/>
-                <w:bCs/>
-                <w:color w:val="FFFFFF"/>
-                <w:sz w:val="20"/>
-                <w:szCs w:val="20"/>
-              </w:rPr>
-              <w:t xml:space="preserve">Statut</w:t>
-            </w:r>
-          </w:p>
-        </w:tc>
       </w:tr>
       <w:tr>
         <w:tc>
           <w:tcPr>
-            <w:tcW w:type="dxa" w:w="2400"/>
+            <w:tcW w:type="dxa" w:w="2600"/>
             <w:tcBorders>
               <w:top w:val="single" w:color="CCCCCC" w:sz="4"/>
               <w:left w:val="single" w:color="CCCCCC" w:sz="4"/>
@@ -582,7 +549,7 @@
         </w:tc>
         <w:tc>
           <w:tcPr>
-            <w:tcW w:type="dxa" w:w="700"/>
+            <w:tcW w:type="dxa" w:w="800"/>
             <w:tcBorders>
               <w:top w:val="single" w:color="CCCCCC" w:sz="4"/>
               <w:left w:val="single" w:color="CCCCCC" w:sz="4"/>
@@ -599,7 +566,7 @@
             <w:vAlign w:val="center"/>
           </w:tcPr>
           <w:p>
-            <w:hyperlink w:history="1" r:id="rIdxtm7k_trmjirqj9vjayel">
+            <w:hyperlink w:history="1" r:id="rIdfzcy3tg6t4ifztvegashu">
               <w:r>
                 <w:rPr>
                   <w:rFonts w:ascii="Tw Cen MT" w:cs="Tw Cen MT" w:eastAsia="Tw Cen MT" w:hAnsi="Tw Cen MT"/>
@@ -615,7 +582,7 @@
         </w:tc>
         <w:tc>
           <w:tcPr>
-            <w:tcW w:type="dxa" w:w="4326"/>
+            <w:tcW w:type="dxa" w:w="4826"/>
             <w:tcBorders>
               <w:top w:val="single" w:color="CCCCCC" w:sz="4"/>
               <w:left w:val="single" w:color="CCCCCC" w:sz="4"/>
@@ -644,7 +611,7 @@
         </w:tc>
         <w:tc>
           <w:tcPr>
-            <w:tcW w:type="dxa" w:w="700"/>
+            <w:tcW w:type="dxa" w:w="800"/>
             <w:tcBorders>
               <w:top w:val="single" w:color="CCCCCC" w:sz="4"/>
               <w:left w:val="single" w:color="CCCCCC" w:sz="4"/>
@@ -661,7 +628,7 @@
             <w:vAlign w:val="center"/>
           </w:tcPr>
           <w:p>
-            <w:hyperlink w:history="1" r:id="rId69giqv2mxbztoyxs9gfxp">
+            <w:hyperlink w:history="1" r:id="rIdyrvgrc2zatrckx0iovz2l">
               <w:r>
                 <w:rPr>
                   <w:rFonts w:ascii="Tw Cen MT" w:cs="Tw Cen MT" w:eastAsia="Tw Cen MT" w:hAnsi="Tw Cen MT"/>
@@ -675,46 +642,11 @@
             </w:hyperlink>
           </w:p>
         </w:tc>
-        <w:tc>
-          <w:tcPr>
-            <w:tcW w:type="dxa" w:w="900"/>
-            <w:tcBorders>
-              <w:top w:val="single" w:color="CCCCCC" w:sz="4"/>
-              <w:left w:val="single" w:color="CCCCCC" w:sz="4"/>
-              <w:bottom w:val="single" w:color="CCCCCC" w:sz="4"/>
-              <w:right w:val="single" w:color="CCCCCC" w:sz="4"/>
-            </w:tcBorders>
-            <w:shd w:fill="FFFFFF" w:val="clear"/>
-            <w:tcMar>
-              <w:top w:type="dxa" w:w="80"/>
-              <w:left w:type="dxa" w:w="120"/>
-              <w:bottom w:type="dxa" w:w="80"/>
-              <w:right w:type="dxa" w:w="120"/>
-            </w:tcMar>
-            <w:vAlign w:val="center"/>
-          </w:tcPr>
-          <w:p>
-            <w:pPr>
-              <w:jc w:val="center"/>
-            </w:pPr>
-            <w:r>
-              <w:rPr>
-                <w:rFonts w:ascii="Tw Cen MT" w:cs="Tw Cen MT" w:eastAsia="Tw Cen MT" w:hAnsi="Tw Cen MT"/>
-                <w:b/>
-                <w:bCs/>
-                <w:color w:val="1F7A4D"/>
-                <w:sz w:val="18"/>
-                <w:szCs w:val="18"/>
-              </w:rPr>
-              <w:t xml:space="preserve">✓ OK</w:t>
-            </w:r>
-          </w:p>
-        </w:tc>
       </w:tr>
       <w:tr>
         <w:tc>
           <w:tcPr>
-            <w:tcW w:type="dxa" w:w="2400"/>
+            <w:tcW w:type="dxa" w:w="2600"/>
             <w:tcBorders>
               <w:top w:val="single" w:color="CCCCCC" w:sz="4"/>
               <w:left w:val="single" w:color="CCCCCC" w:sz="4"/>
@@ -743,7 +675,7 @@
         </w:tc>
         <w:tc>
           <w:tcPr>
-            <w:tcW w:type="dxa" w:w="700"/>
+            <w:tcW w:type="dxa" w:w="800"/>
             <w:tcBorders>
               <w:top w:val="single" w:color="CCCCCC" w:sz="4"/>
               <w:left w:val="single" w:color="CCCCCC" w:sz="4"/>
@@ -760,7 +692,7 @@
             <w:vAlign w:val="center"/>
           </w:tcPr>
           <w:p>
-            <w:hyperlink w:history="1" r:id="rIdsy05euxtjxz0rj_2qv1sf">
+            <w:hyperlink w:history="1" r:id="rIdo_as2gqk1idykvtkanyys">
               <w:r>
                 <w:rPr>
                   <w:rFonts w:ascii="Tw Cen MT" w:cs="Tw Cen MT" w:eastAsia="Tw Cen MT" w:hAnsi="Tw Cen MT"/>
@@ -776,7 +708,7 @@
         </w:tc>
         <w:tc>
           <w:tcPr>
-            <w:tcW w:type="dxa" w:w="4326"/>
+            <w:tcW w:type="dxa" w:w="4826"/>
             <w:tcBorders>
               <w:top w:val="single" w:color="CCCCCC" w:sz="4"/>
               <w:left w:val="single" w:color="CCCCCC" w:sz="4"/>
@@ -805,7 +737,7 @@
         </w:tc>
         <w:tc>
           <w:tcPr>
-            <w:tcW w:type="dxa" w:w="700"/>
+            <w:tcW w:type="dxa" w:w="800"/>
             <w:tcBorders>
               <w:top w:val="single" w:color="CCCCCC" w:sz="4"/>
               <w:left w:val="single" w:color="CCCCCC" w:sz="4"/>
@@ -822,7 +754,7 @@
             <w:vAlign w:val="center"/>
           </w:tcPr>
           <w:p>
-            <w:hyperlink w:history="1" r:id="rIdd7j4g2-uynavrjhvfzvyo">
+            <w:hyperlink w:history="1" r:id="rId9djkjrp-prhn7qgdpnkem">
               <w:r>
                 <w:rPr>
                   <w:rFonts w:ascii="Tw Cen MT" w:cs="Tw Cen MT" w:eastAsia="Tw Cen MT" w:hAnsi="Tw Cen MT"/>
@@ -836,46 +768,11 @@
             </w:hyperlink>
           </w:p>
         </w:tc>
-        <w:tc>
-          <w:tcPr>
-            <w:tcW w:type="dxa" w:w="900"/>
-            <w:tcBorders>
-              <w:top w:val="single" w:color="CCCCCC" w:sz="4"/>
-              <w:left w:val="single" w:color="CCCCCC" w:sz="4"/>
-              <w:bottom w:val="single" w:color="CCCCCC" w:sz="4"/>
-              <w:right w:val="single" w:color="CCCCCC" w:sz="4"/>
-            </w:tcBorders>
-            <w:shd w:fill="F2F2F2" w:val="clear"/>
-            <w:tcMar>
-              <w:top w:type="dxa" w:w="80"/>
-              <w:left w:type="dxa" w:w="120"/>
-              <w:bottom w:type="dxa" w:w="80"/>
-              <w:right w:type="dxa" w:w="120"/>
-            </w:tcMar>
-            <w:vAlign w:val="center"/>
-          </w:tcPr>
-          <w:p>
-            <w:pPr>
-              <w:jc w:val="center"/>
-            </w:pPr>
-            <w:r>
-              <w:rPr>
-                <w:rFonts w:ascii="Tw Cen MT" w:cs="Tw Cen MT" w:eastAsia="Tw Cen MT" w:hAnsi="Tw Cen MT"/>
-                <w:b/>
-                <w:bCs/>
-                <w:color w:val="1F7A4D"/>
-                <w:sz w:val="18"/>
-                <w:szCs w:val="18"/>
-              </w:rPr>
-              <w:t xml:space="preserve">✓ OK</w:t>
-            </w:r>
-          </w:p>
-        </w:tc>
       </w:tr>
       <w:tr>
         <w:tc>
           <w:tcPr>
-            <w:tcW w:type="dxa" w:w="2400"/>
+            <w:tcW w:type="dxa" w:w="2600"/>
             <w:tcBorders>
               <w:top w:val="single" w:color="CCCCCC" w:sz="4"/>
               <w:left w:val="single" w:color="CCCCCC" w:sz="4"/>
@@ -904,7 +801,7 @@
         </w:tc>
         <w:tc>
           <w:tcPr>
-            <w:tcW w:type="dxa" w:w="700"/>
+            <w:tcW w:type="dxa" w:w="800"/>
             <w:tcBorders>
               <w:top w:val="single" w:color="CCCCCC" w:sz="4"/>
               <w:left w:val="single" w:color="CCCCCC" w:sz="4"/>
@@ -921,7 +818,7 @@
             <w:vAlign w:val="center"/>
           </w:tcPr>
           <w:p>
-            <w:hyperlink w:history="1" r:id="rIdoujasnzt4c4mqmd8jlkba">
+            <w:hyperlink w:history="1" r:id="rId68lqpxr1pz9mqvi-g8qem">
               <w:r>
                 <w:rPr>
                   <w:rFonts w:ascii="Tw Cen MT" w:cs="Tw Cen MT" w:eastAsia="Tw Cen MT" w:hAnsi="Tw Cen MT"/>
@@ -937,7 +834,7 @@
         </w:tc>
         <w:tc>
           <w:tcPr>
-            <w:tcW w:type="dxa" w:w="4326"/>
+            <w:tcW w:type="dxa" w:w="4826"/>
             <w:tcBorders>
               <w:top w:val="single" w:color="CCCCCC" w:sz="4"/>
               <w:left w:val="single" w:color="CCCCCC" w:sz="4"/>
@@ -966,7 +863,7 @@
         </w:tc>
         <w:tc>
           <w:tcPr>
-            <w:tcW w:type="dxa" w:w="700"/>
+            <w:tcW w:type="dxa" w:w="800"/>
             <w:tcBorders>
               <w:top w:val="single" w:color="CCCCCC" w:sz="4"/>
               <w:left w:val="single" w:color="CCCCCC" w:sz="4"/>
@@ -983,7 +880,7 @@
             <w:vAlign w:val="center"/>
           </w:tcPr>
           <w:p>
-            <w:hyperlink w:history="1" r:id="rIdp6ydwxvhqtj2ygdjk9yiq">
+            <w:hyperlink w:history="1" r:id="rIdtym3ocfvcpz7kgl6prrx3">
               <w:r>
                 <w:rPr>
                   <w:rFonts w:ascii="Tw Cen MT" w:cs="Tw Cen MT" w:eastAsia="Tw Cen MT" w:hAnsi="Tw Cen MT"/>
@@ -997,46 +894,11 @@
             </w:hyperlink>
           </w:p>
         </w:tc>
-        <w:tc>
-          <w:tcPr>
-            <w:tcW w:type="dxa" w:w="900"/>
-            <w:tcBorders>
-              <w:top w:val="single" w:color="CCCCCC" w:sz="4"/>
-              <w:left w:val="single" w:color="CCCCCC" w:sz="4"/>
-              <w:bottom w:val="single" w:color="CCCCCC" w:sz="4"/>
-              <w:right w:val="single" w:color="CCCCCC" w:sz="4"/>
-            </w:tcBorders>
-            <w:shd w:fill="FFFFFF" w:val="clear"/>
-            <w:tcMar>
-              <w:top w:type="dxa" w:w="80"/>
-              <w:left w:type="dxa" w:w="120"/>
-              <w:bottom w:type="dxa" w:w="80"/>
-              <w:right w:type="dxa" w:w="120"/>
-            </w:tcMar>
-            <w:vAlign w:val="center"/>
-          </w:tcPr>
-          <w:p>
-            <w:pPr>
-              <w:jc w:val="center"/>
-            </w:pPr>
-            <w:r>
-              <w:rPr>
-                <w:rFonts w:ascii="Tw Cen MT" w:cs="Tw Cen MT" w:eastAsia="Tw Cen MT" w:hAnsi="Tw Cen MT"/>
-                <w:b/>
-                <w:bCs/>
-                <w:color w:val="1F7A4D"/>
-                <w:sz w:val="18"/>
-                <w:szCs w:val="18"/>
-              </w:rPr>
-              <w:t xml:space="preserve">✓ OK</w:t>
-            </w:r>
-          </w:p>
-        </w:tc>
       </w:tr>
       <w:tr>
         <w:tc>
           <w:tcPr>
-            <w:tcW w:type="dxa" w:w="2400"/>
+            <w:tcW w:type="dxa" w:w="2600"/>
             <w:tcBorders>
               <w:top w:val="single" w:color="CCCCCC" w:sz="4"/>
               <w:left w:val="single" w:color="CCCCCC" w:sz="4"/>
@@ -1065,7 +927,7 @@
         </w:tc>
         <w:tc>
           <w:tcPr>
-            <w:tcW w:type="dxa" w:w="700"/>
+            <w:tcW w:type="dxa" w:w="800"/>
             <w:tcBorders>
               <w:top w:val="single" w:color="CCCCCC" w:sz="4"/>
               <w:left w:val="single" w:color="CCCCCC" w:sz="4"/>
@@ -1082,7 +944,7 @@
             <w:vAlign w:val="center"/>
           </w:tcPr>
           <w:p>
-            <w:hyperlink w:history="1" r:id="rIdmnpdewp52sy5h-pfnajvl">
+            <w:hyperlink w:history="1" r:id="rIdccgnr6wnxs90z_of-v33t">
               <w:r>
                 <w:rPr>
                   <w:rFonts w:ascii="Tw Cen MT" w:cs="Tw Cen MT" w:eastAsia="Tw Cen MT" w:hAnsi="Tw Cen MT"/>
@@ -1098,7 +960,7 @@
         </w:tc>
         <w:tc>
           <w:tcPr>
-            <w:tcW w:type="dxa" w:w="4326"/>
+            <w:tcW w:type="dxa" w:w="4826"/>
             <w:tcBorders>
               <w:top w:val="single" w:color="CCCCCC" w:sz="4"/>
               <w:left w:val="single" w:color="CCCCCC" w:sz="4"/>
@@ -1127,7 +989,7 @@
         </w:tc>
         <w:tc>
           <w:tcPr>
-            <w:tcW w:type="dxa" w:w="700"/>
+            <w:tcW w:type="dxa" w:w="800"/>
             <w:tcBorders>
               <w:top w:val="single" w:color="CCCCCC" w:sz="4"/>
               <w:left w:val="single" w:color="CCCCCC" w:sz="4"/>
@@ -1144,7 +1006,7 @@
             <w:vAlign w:val="center"/>
           </w:tcPr>
           <w:p>
-            <w:hyperlink w:history="1" r:id="rIdl558mvm153zxig0ycvfgb">
+            <w:hyperlink w:history="1" r:id="rIdc-yeazfikskmslj81olml">
               <w:r>
                 <w:rPr>
                   <w:rFonts w:ascii="Tw Cen MT" w:cs="Tw Cen MT" w:eastAsia="Tw Cen MT" w:hAnsi="Tw Cen MT"/>
@@ -1156,41 +1018,6 @@
                 <w:t xml:space="preserve">🔊</w:t>
               </w:r>
             </w:hyperlink>
-          </w:p>
-        </w:tc>
-        <w:tc>
-          <w:tcPr>
-            <w:tcW w:type="dxa" w:w="900"/>
-            <w:tcBorders>
-              <w:top w:val="single" w:color="CCCCCC" w:sz="4"/>
-              <w:left w:val="single" w:color="CCCCCC" w:sz="4"/>
-              <w:bottom w:val="single" w:color="CCCCCC" w:sz="4"/>
-              <w:right w:val="single" w:color="CCCCCC" w:sz="4"/>
-            </w:tcBorders>
-            <w:shd w:fill="F2F2F2" w:val="clear"/>
-            <w:tcMar>
-              <w:top w:type="dxa" w:w="80"/>
-              <w:left w:type="dxa" w:w="120"/>
-              <w:bottom w:type="dxa" w:w="80"/>
-              <w:right w:type="dxa" w:w="120"/>
-            </w:tcMar>
-            <w:vAlign w:val="center"/>
-          </w:tcPr>
-          <w:p>
-            <w:pPr>
-              <w:jc w:val="center"/>
-            </w:pPr>
-            <w:r>
-              <w:rPr>
-                <w:rFonts w:ascii="Tw Cen MT" w:cs="Tw Cen MT" w:eastAsia="Tw Cen MT" w:hAnsi="Tw Cen MT"/>
-                <w:b/>
-                <w:bCs/>
-                <w:color w:val="1F7A4D"/>
-                <w:sz w:val="18"/>
-                <w:szCs w:val="18"/>
-              </w:rPr>
-              <w:t xml:space="preserve">✓ OK</w:t>
-            </w:r>
           </w:p>
         </w:tc>
       </w:tr>
@@ -1232,16 +1059,15 @@
         </w:tblBorders>
       </w:tblPr>
       <w:tblGrid>
-        <w:gridCol w:w="2400"/>
-        <w:gridCol w:w="700"/>
-        <w:gridCol w:w="4326"/>
-        <w:gridCol w:w="700"/>
-        <w:gridCol w:w="900"/>
+        <w:gridCol w:w="2600"/>
+        <w:gridCol w:w="800"/>
+        <w:gridCol w:w="4826"/>
+        <w:gridCol w:w="800"/>
       </w:tblGrid>
       <w:tr>
         <w:tc>
           <w:tcPr>
-            <w:tcW w:type="dxa" w:w="2400"/>
+            <w:tcW w:type="dxa" w:w="2600"/>
             <w:tcBorders>
               <w:top w:val="single" w:color="CCCCCC" w:sz="4"/>
               <w:left w:val="single" w:color="CCCCCC" w:sz="4"/>
@@ -1273,7 +1099,7 @@
         </w:tc>
         <w:tc>
           <w:tcPr>
-            <w:tcW w:type="dxa" w:w="700"/>
+            <w:tcW w:type="dxa" w:w="800"/>
             <w:tcBorders>
               <w:top w:val="single" w:color="CCCCCC" w:sz="4"/>
               <w:left w:val="single" w:color="CCCCCC" w:sz="4"/>
@@ -1305,7 +1131,7 @@
         </w:tc>
         <w:tc>
           <w:tcPr>
-            <w:tcW w:type="dxa" w:w="4326"/>
+            <w:tcW w:type="dxa" w:w="4826"/>
             <w:tcBorders>
               <w:top w:val="single" w:color="CCCCCC" w:sz="4"/>
               <w:left w:val="single" w:color="CCCCCC" w:sz="4"/>
@@ -1337,7 +1163,7 @@
         </w:tc>
         <w:tc>
           <w:tcPr>
-            <w:tcW w:type="dxa" w:w="700"/>
+            <w:tcW w:type="dxa" w:w="800"/>
             <w:tcBorders>
               <w:top w:val="single" w:color="CCCCCC" w:sz="4"/>
               <w:left w:val="single" w:color="CCCCCC" w:sz="4"/>
@@ -1367,43 +1193,11 @@
             </w:r>
           </w:p>
         </w:tc>
-        <w:tc>
-          <w:tcPr>
-            <w:tcW w:type="dxa" w:w="900"/>
-            <w:tcBorders>
-              <w:top w:val="single" w:color="CCCCCC" w:sz="4"/>
-              <w:left w:val="single" w:color="CCCCCC" w:sz="4"/>
-              <w:bottom w:val="single" w:color="CCCCCC" w:sz="4"/>
-              <w:right w:val="single" w:color="CCCCCC" w:sz="4"/>
-            </w:tcBorders>
-            <w:shd w:fill="004A9F" w:val="clear"/>
-            <w:tcMar>
-              <w:top w:type="dxa" w:w="80"/>
-              <w:left w:type="dxa" w:w="120"/>
-              <w:bottom w:type="dxa" w:w="80"/>
-              <w:right w:type="dxa" w:w="120"/>
-            </w:tcMar>
-            <w:vAlign w:val="center"/>
-          </w:tcPr>
-          <w:p>
-            <w:r>
-              <w:rPr>
-                <w:rFonts w:ascii="Tw Cen MT" w:cs="Tw Cen MT" w:eastAsia="Tw Cen MT" w:hAnsi="Tw Cen MT"/>
-                <w:b/>
-                <w:bCs/>
-                <w:color w:val="FFFFFF"/>
-                <w:sz w:val="20"/>
-                <w:szCs w:val="20"/>
-              </w:rPr>
-              <w:t xml:space="preserve">Statut</w:t>
-            </w:r>
-          </w:p>
-        </w:tc>
       </w:tr>
       <w:tr>
         <w:tc>
           <w:tcPr>
-            <w:tcW w:type="dxa" w:w="2400"/>
+            <w:tcW w:type="dxa" w:w="2600"/>
             <w:tcBorders>
               <w:top w:val="single" w:color="CCCCCC" w:sz="4"/>
               <w:left w:val="single" w:color="CCCCCC" w:sz="4"/>
@@ -1432,7 +1226,7 @@
         </w:tc>
         <w:tc>
           <w:tcPr>
-            <w:tcW w:type="dxa" w:w="700"/>
+            <w:tcW w:type="dxa" w:w="800"/>
             <w:tcBorders>
               <w:top w:val="single" w:color="CCCCCC" w:sz="4"/>
               <w:left w:val="single" w:color="CCCCCC" w:sz="4"/>
@@ -1449,7 +1243,7 @@
             <w:vAlign w:val="center"/>
           </w:tcPr>
           <w:p>
-            <w:hyperlink w:history="1" r:id="rIdvplkk-1gdj2twrmk1ijgm">
+            <w:hyperlink w:history="1" r:id="rIdb6u-zhxfyvtq_tjcggmp9">
               <w:r>
                 <w:rPr>
                   <w:rFonts w:ascii="Tw Cen MT" w:cs="Tw Cen MT" w:eastAsia="Tw Cen MT" w:hAnsi="Tw Cen MT"/>
@@ -1465,7 +1259,7 @@
         </w:tc>
         <w:tc>
           <w:tcPr>
-            <w:tcW w:type="dxa" w:w="4326"/>
+            <w:tcW w:type="dxa" w:w="4826"/>
             <w:tcBorders>
               <w:top w:val="single" w:color="CCCCCC" w:sz="4"/>
               <w:left w:val="single" w:color="CCCCCC" w:sz="4"/>
@@ -1494,7 +1288,7 @@
         </w:tc>
         <w:tc>
           <w:tcPr>
-            <w:tcW w:type="dxa" w:w="700"/>
+            <w:tcW w:type="dxa" w:w="800"/>
             <w:tcBorders>
               <w:top w:val="single" w:color="CCCCCC" w:sz="4"/>
               <w:left w:val="single" w:color="CCCCCC" w:sz="4"/>
@@ -1511,7 +1305,7 @@
             <w:vAlign w:val="center"/>
           </w:tcPr>
           <w:p>
-            <w:hyperlink w:history="1" r:id="rIdlexflfi98kcytv_ajvz3i">
+            <w:hyperlink w:history="1" r:id="rIdxb2unvgt8qd_7jpzypcww">
               <w:r>
                 <w:rPr>
                   <w:rFonts w:ascii="Tw Cen MT" w:cs="Tw Cen MT" w:eastAsia="Tw Cen MT" w:hAnsi="Tw Cen MT"/>
@@ -1525,46 +1319,11 @@
             </w:hyperlink>
           </w:p>
         </w:tc>
-        <w:tc>
-          <w:tcPr>
-            <w:tcW w:type="dxa" w:w="900"/>
-            <w:tcBorders>
-              <w:top w:val="single" w:color="CCCCCC" w:sz="4"/>
-              <w:left w:val="single" w:color="CCCCCC" w:sz="4"/>
-              <w:bottom w:val="single" w:color="CCCCCC" w:sz="4"/>
-              <w:right w:val="single" w:color="CCCCCC" w:sz="4"/>
-            </w:tcBorders>
-            <w:shd w:fill="FFFFFF" w:val="clear"/>
-            <w:tcMar>
-              <w:top w:type="dxa" w:w="80"/>
-              <w:left w:type="dxa" w:w="120"/>
-              <w:bottom w:type="dxa" w:w="80"/>
-              <w:right w:type="dxa" w:w="120"/>
-            </w:tcMar>
-            <w:vAlign w:val="center"/>
-          </w:tcPr>
-          <w:p>
-            <w:pPr>
-              <w:jc w:val="center"/>
-            </w:pPr>
-            <w:r>
-              <w:rPr>
-                <w:rFonts w:ascii="Tw Cen MT" w:cs="Tw Cen MT" w:eastAsia="Tw Cen MT" w:hAnsi="Tw Cen MT"/>
-                <w:b/>
-                <w:bCs/>
-                <w:color w:val="1F7A4D"/>
-                <w:sz w:val="18"/>
-                <w:szCs w:val="18"/>
-              </w:rPr>
-              <w:t xml:space="preserve">✓ OK</w:t>
-            </w:r>
-          </w:p>
-        </w:tc>
       </w:tr>
       <w:tr>
         <w:tc>
           <w:tcPr>
-            <w:tcW w:type="dxa" w:w="2400"/>
+            <w:tcW w:type="dxa" w:w="2600"/>
             <w:tcBorders>
               <w:top w:val="single" w:color="CCCCCC" w:sz="4"/>
               <w:left w:val="single" w:color="CCCCCC" w:sz="4"/>
@@ -1593,7 +1352,7 @@
         </w:tc>
         <w:tc>
           <w:tcPr>
-            <w:tcW w:type="dxa" w:w="700"/>
+            <w:tcW w:type="dxa" w:w="800"/>
             <w:tcBorders>
               <w:top w:val="single" w:color="CCCCCC" w:sz="4"/>
               <w:left w:val="single" w:color="CCCCCC" w:sz="4"/>
@@ -1610,7 +1369,7 @@
             <w:vAlign w:val="center"/>
           </w:tcPr>
           <w:p>
-            <w:hyperlink w:history="1" r:id="rIdmyvtyr2vjaces5o1xsic8">
+            <w:hyperlink w:history="1" r:id="rIdw3brnqyhjg1xmhs77chp5">
               <w:r>
                 <w:rPr>
                   <w:rFonts w:ascii="Tw Cen MT" w:cs="Tw Cen MT" w:eastAsia="Tw Cen MT" w:hAnsi="Tw Cen MT"/>
@@ -1626,7 +1385,7 @@
         </w:tc>
         <w:tc>
           <w:tcPr>
-            <w:tcW w:type="dxa" w:w="4326"/>
+            <w:tcW w:type="dxa" w:w="4826"/>
             <w:tcBorders>
               <w:top w:val="single" w:color="CCCCCC" w:sz="4"/>
               <w:left w:val="single" w:color="CCCCCC" w:sz="4"/>
@@ -1655,7 +1414,7 @@
         </w:tc>
         <w:tc>
           <w:tcPr>
-            <w:tcW w:type="dxa" w:w="700"/>
+            <w:tcW w:type="dxa" w:w="800"/>
             <w:tcBorders>
               <w:top w:val="single" w:color="CCCCCC" w:sz="4"/>
               <w:left w:val="single" w:color="CCCCCC" w:sz="4"/>
@@ -1672,7 +1431,7 @@
             <w:vAlign w:val="center"/>
           </w:tcPr>
           <w:p>
-            <w:hyperlink w:history="1" r:id="rIdf3ieoj_ijkcvwddrksip0">
+            <w:hyperlink w:history="1" r:id="rIdzzquglevxbgktyyxlkvv5">
               <w:r>
                 <w:rPr>
                   <w:rFonts w:ascii="Tw Cen MT" w:cs="Tw Cen MT" w:eastAsia="Tw Cen MT" w:hAnsi="Tw Cen MT"/>
@@ -1686,46 +1445,11 @@
             </w:hyperlink>
           </w:p>
         </w:tc>
-        <w:tc>
-          <w:tcPr>
-            <w:tcW w:type="dxa" w:w="900"/>
-            <w:tcBorders>
-              <w:top w:val="single" w:color="CCCCCC" w:sz="4"/>
-              <w:left w:val="single" w:color="CCCCCC" w:sz="4"/>
-              <w:bottom w:val="single" w:color="CCCCCC" w:sz="4"/>
-              <w:right w:val="single" w:color="CCCCCC" w:sz="4"/>
-            </w:tcBorders>
-            <w:shd w:fill="F2F2F2" w:val="clear"/>
-            <w:tcMar>
-              <w:top w:type="dxa" w:w="80"/>
-              <w:left w:type="dxa" w:w="120"/>
-              <w:bottom w:type="dxa" w:w="80"/>
-              <w:right w:type="dxa" w:w="120"/>
-            </w:tcMar>
-            <w:vAlign w:val="center"/>
-          </w:tcPr>
-          <w:p>
-            <w:pPr>
-              <w:jc w:val="center"/>
-            </w:pPr>
-            <w:r>
-              <w:rPr>
-                <w:rFonts w:ascii="Tw Cen MT" w:cs="Tw Cen MT" w:eastAsia="Tw Cen MT" w:hAnsi="Tw Cen MT"/>
-                <w:b/>
-                <w:bCs/>
-                <w:color w:val="1F7A4D"/>
-                <w:sz w:val="18"/>
-                <w:szCs w:val="18"/>
-              </w:rPr>
-              <w:t xml:space="preserve">✓ OK</w:t>
-            </w:r>
-          </w:p>
-        </w:tc>
       </w:tr>
       <w:tr>
         <w:tc>
           <w:tcPr>
-            <w:tcW w:type="dxa" w:w="2400"/>
+            <w:tcW w:type="dxa" w:w="2600"/>
             <w:tcBorders>
               <w:top w:val="single" w:color="CCCCCC" w:sz="4"/>
               <w:left w:val="single" w:color="CCCCCC" w:sz="4"/>
@@ -1754,7 +1478,7 @@
         </w:tc>
         <w:tc>
           <w:tcPr>
-            <w:tcW w:type="dxa" w:w="700"/>
+            <w:tcW w:type="dxa" w:w="800"/>
             <w:tcBorders>
               <w:top w:val="single" w:color="CCCCCC" w:sz="4"/>
               <w:left w:val="single" w:color="CCCCCC" w:sz="4"/>
@@ -1771,7 +1495,7 @@
             <w:vAlign w:val="center"/>
           </w:tcPr>
           <w:p>
-            <w:hyperlink w:history="1" r:id="rId6o6yxemragxw3yfxh7sj_">
+            <w:hyperlink w:history="1" r:id="rIdpziuw5wasiqtvnfiikz7f">
               <w:r>
                 <w:rPr>
                   <w:rFonts w:ascii="Tw Cen MT" w:cs="Tw Cen MT" w:eastAsia="Tw Cen MT" w:hAnsi="Tw Cen MT"/>
@@ -1787,7 +1511,7 @@
         </w:tc>
         <w:tc>
           <w:tcPr>
-            <w:tcW w:type="dxa" w:w="4326"/>
+            <w:tcW w:type="dxa" w:w="4826"/>
             <w:tcBorders>
               <w:top w:val="single" w:color="CCCCCC" w:sz="4"/>
               <w:left w:val="single" w:color="CCCCCC" w:sz="4"/>
@@ -1816,7 +1540,7 @@
         </w:tc>
         <w:tc>
           <w:tcPr>
-            <w:tcW w:type="dxa" w:w="700"/>
+            <w:tcW w:type="dxa" w:w="800"/>
             <w:tcBorders>
               <w:top w:val="single" w:color="CCCCCC" w:sz="4"/>
               <w:left w:val="single" w:color="CCCCCC" w:sz="4"/>
@@ -1833,7 +1557,7 @@
             <w:vAlign w:val="center"/>
           </w:tcPr>
           <w:p>
-            <w:hyperlink w:history="1" r:id="rIdosw4ukcwnr7wb0jrrzwcq">
+            <w:hyperlink w:history="1" r:id="rIdczow00apfiumdmguzqwxk">
               <w:r>
                 <w:rPr>
                   <w:rFonts w:ascii="Tw Cen MT" w:cs="Tw Cen MT" w:eastAsia="Tw Cen MT" w:hAnsi="Tw Cen MT"/>
@@ -1847,46 +1571,11 @@
             </w:hyperlink>
           </w:p>
         </w:tc>
-        <w:tc>
-          <w:tcPr>
-            <w:tcW w:type="dxa" w:w="900"/>
-            <w:tcBorders>
-              <w:top w:val="single" w:color="CCCCCC" w:sz="4"/>
-              <w:left w:val="single" w:color="CCCCCC" w:sz="4"/>
-              <w:bottom w:val="single" w:color="CCCCCC" w:sz="4"/>
-              <w:right w:val="single" w:color="CCCCCC" w:sz="4"/>
-            </w:tcBorders>
-            <w:shd w:fill="FFFFFF" w:val="clear"/>
-            <w:tcMar>
-              <w:top w:type="dxa" w:w="80"/>
-              <w:left w:type="dxa" w:w="120"/>
-              <w:bottom w:type="dxa" w:w="80"/>
-              <w:right w:type="dxa" w:w="120"/>
-            </w:tcMar>
-            <w:vAlign w:val="center"/>
-          </w:tcPr>
-          <w:p>
-            <w:pPr>
-              <w:jc w:val="center"/>
-            </w:pPr>
-            <w:r>
-              <w:rPr>
-                <w:rFonts w:ascii="Tw Cen MT" w:cs="Tw Cen MT" w:eastAsia="Tw Cen MT" w:hAnsi="Tw Cen MT"/>
-                <w:b/>
-                <w:bCs/>
-                <w:color w:val="1F7A4D"/>
-                <w:sz w:val="18"/>
-                <w:szCs w:val="18"/>
-              </w:rPr>
-              <w:t xml:space="preserve">✓ OK</w:t>
-            </w:r>
-          </w:p>
-        </w:tc>
       </w:tr>
       <w:tr>
         <w:tc>
           <w:tcPr>
-            <w:tcW w:type="dxa" w:w="2400"/>
+            <w:tcW w:type="dxa" w:w="2600"/>
             <w:tcBorders>
               <w:top w:val="single" w:color="CCCCCC" w:sz="4"/>
               <w:left w:val="single" w:color="CCCCCC" w:sz="4"/>
@@ -1915,7 +1604,7 @@
         </w:tc>
         <w:tc>
           <w:tcPr>
-            <w:tcW w:type="dxa" w:w="700"/>
+            <w:tcW w:type="dxa" w:w="800"/>
             <w:tcBorders>
               <w:top w:val="single" w:color="CCCCCC" w:sz="4"/>
               <w:left w:val="single" w:color="CCCCCC" w:sz="4"/>
@@ -1932,7 +1621,7 @@
             <w:vAlign w:val="center"/>
           </w:tcPr>
           <w:p>
-            <w:hyperlink w:history="1" r:id="rIdnbekkvuj4qe-seli67bot">
+            <w:hyperlink w:history="1" r:id="rIdtubbkmjcfpgup6d2p-rtj">
               <w:r>
                 <w:rPr>
                   <w:rFonts w:ascii="Tw Cen MT" w:cs="Tw Cen MT" w:eastAsia="Tw Cen MT" w:hAnsi="Tw Cen MT"/>
@@ -1948,7 +1637,7 @@
         </w:tc>
         <w:tc>
           <w:tcPr>
-            <w:tcW w:type="dxa" w:w="4326"/>
+            <w:tcW w:type="dxa" w:w="4826"/>
             <w:tcBorders>
               <w:top w:val="single" w:color="CCCCCC" w:sz="4"/>
               <w:left w:val="single" w:color="CCCCCC" w:sz="4"/>
@@ -1977,7 +1666,7 @@
         </w:tc>
         <w:tc>
           <w:tcPr>
-            <w:tcW w:type="dxa" w:w="700"/>
+            <w:tcW w:type="dxa" w:w="800"/>
             <w:tcBorders>
               <w:top w:val="single" w:color="CCCCCC" w:sz="4"/>
               <w:left w:val="single" w:color="CCCCCC" w:sz="4"/>
@@ -1994,7 +1683,7 @@
             <w:vAlign w:val="center"/>
           </w:tcPr>
           <w:p>
-            <w:hyperlink w:history="1" r:id="rIdvuxwaj42bv1yaxwcipfpq">
+            <w:hyperlink w:history="1" r:id="rIdsl1zi7dfnqawj9-1kfqgd">
               <w:r>
                 <w:rPr>
                   <w:rFonts w:ascii="Tw Cen MT" w:cs="Tw Cen MT" w:eastAsia="Tw Cen MT" w:hAnsi="Tw Cen MT"/>
@@ -2008,46 +1697,11 @@
             </w:hyperlink>
           </w:p>
         </w:tc>
-        <w:tc>
-          <w:tcPr>
-            <w:tcW w:type="dxa" w:w="900"/>
-            <w:tcBorders>
-              <w:top w:val="single" w:color="CCCCCC" w:sz="4"/>
-              <w:left w:val="single" w:color="CCCCCC" w:sz="4"/>
-              <w:bottom w:val="single" w:color="CCCCCC" w:sz="4"/>
-              <w:right w:val="single" w:color="CCCCCC" w:sz="4"/>
-            </w:tcBorders>
-            <w:shd w:fill="F2F2F2" w:val="clear"/>
-            <w:tcMar>
-              <w:top w:type="dxa" w:w="80"/>
-              <w:left w:type="dxa" w:w="120"/>
-              <w:bottom w:type="dxa" w:w="80"/>
-              <w:right w:type="dxa" w:w="120"/>
-            </w:tcMar>
-            <w:vAlign w:val="center"/>
-          </w:tcPr>
-          <w:p>
-            <w:pPr>
-              <w:jc w:val="center"/>
-            </w:pPr>
-            <w:r>
-              <w:rPr>
-                <w:rFonts w:ascii="Tw Cen MT" w:cs="Tw Cen MT" w:eastAsia="Tw Cen MT" w:hAnsi="Tw Cen MT"/>
-                <w:b/>
-                <w:bCs/>
-                <w:color w:val="1F7A4D"/>
-                <w:sz w:val="18"/>
-                <w:szCs w:val="18"/>
-              </w:rPr>
-              <w:t xml:space="preserve">✓ OK</w:t>
-            </w:r>
-          </w:p>
-        </w:tc>
       </w:tr>
       <w:tr>
         <w:tc>
           <w:tcPr>
-            <w:tcW w:type="dxa" w:w="2400"/>
+            <w:tcW w:type="dxa" w:w="2600"/>
             <w:tcBorders>
               <w:top w:val="single" w:color="CCCCCC" w:sz="4"/>
               <w:left w:val="single" w:color="CCCCCC" w:sz="4"/>
@@ -2076,7 +1730,7 @@
         </w:tc>
         <w:tc>
           <w:tcPr>
-            <w:tcW w:type="dxa" w:w="700"/>
+            <w:tcW w:type="dxa" w:w="800"/>
             <w:tcBorders>
               <w:top w:val="single" w:color="CCCCCC" w:sz="4"/>
               <w:left w:val="single" w:color="CCCCCC" w:sz="4"/>
@@ -2093,7 +1747,7 @@
             <w:vAlign w:val="center"/>
           </w:tcPr>
           <w:p>
-            <w:hyperlink w:history="1" r:id="rIdsddspo5b3vmsu6u0ijf8o">
+            <w:hyperlink w:history="1" r:id="rIdwnr5qqzipb9q1ofjybnrl">
               <w:r>
                 <w:rPr>
                   <w:rFonts w:ascii="Tw Cen MT" w:cs="Tw Cen MT" w:eastAsia="Tw Cen MT" w:hAnsi="Tw Cen MT"/>
@@ -2109,7 +1763,7 @@
         </w:tc>
         <w:tc>
           <w:tcPr>
-            <w:tcW w:type="dxa" w:w="4326"/>
+            <w:tcW w:type="dxa" w:w="4826"/>
             <w:tcBorders>
               <w:top w:val="single" w:color="CCCCCC" w:sz="4"/>
               <w:left w:val="single" w:color="CCCCCC" w:sz="4"/>
@@ -2138,7 +1792,7 @@
         </w:tc>
         <w:tc>
           <w:tcPr>
-            <w:tcW w:type="dxa" w:w="700"/>
+            <w:tcW w:type="dxa" w:w="800"/>
             <w:tcBorders>
               <w:top w:val="single" w:color="CCCCCC" w:sz="4"/>
               <w:left w:val="single" w:color="CCCCCC" w:sz="4"/>
@@ -2155,7 +1809,7 @@
             <w:vAlign w:val="center"/>
           </w:tcPr>
           <w:p>
-            <w:hyperlink w:history="1" r:id="rIdm-ybxihsfhpt7mxu5r_kg">
+            <w:hyperlink w:history="1" r:id="rId6xgffzljf7ouqbqlbobpq">
               <w:r>
                 <w:rPr>
                   <w:rFonts w:ascii="Tw Cen MT" w:cs="Tw Cen MT" w:eastAsia="Tw Cen MT" w:hAnsi="Tw Cen MT"/>
@@ -2167,41 +1821,6 @@
                 <w:t xml:space="preserve">🔊</w:t>
               </w:r>
             </w:hyperlink>
-          </w:p>
-        </w:tc>
-        <w:tc>
-          <w:tcPr>
-            <w:tcW w:type="dxa" w:w="900"/>
-            <w:tcBorders>
-              <w:top w:val="single" w:color="CCCCCC" w:sz="4"/>
-              <w:left w:val="single" w:color="CCCCCC" w:sz="4"/>
-              <w:bottom w:val="single" w:color="CCCCCC" w:sz="4"/>
-              <w:right w:val="single" w:color="CCCCCC" w:sz="4"/>
-            </w:tcBorders>
-            <w:shd w:fill="FFFFFF" w:val="clear"/>
-            <w:tcMar>
-              <w:top w:type="dxa" w:w="80"/>
-              <w:left w:type="dxa" w:w="120"/>
-              <w:bottom w:type="dxa" w:w="80"/>
-              <w:right w:type="dxa" w:w="120"/>
-            </w:tcMar>
-            <w:vAlign w:val="center"/>
-          </w:tcPr>
-          <w:p>
-            <w:pPr>
-              <w:jc w:val="center"/>
-            </w:pPr>
-            <w:r>
-              <w:rPr>
-                <w:rFonts w:ascii="Tw Cen MT" w:cs="Tw Cen MT" w:eastAsia="Tw Cen MT" w:hAnsi="Tw Cen MT"/>
-                <w:b/>
-                <w:bCs/>
-                <w:color w:val="1F7A4D"/>
-                <w:sz w:val="18"/>
-                <w:szCs w:val="18"/>
-              </w:rPr>
-              <w:t xml:space="preserve">✓ OK</w:t>
-            </w:r>
           </w:p>
         </w:tc>
       </w:tr>
@@ -2243,16 +1862,15 @@
         </w:tblBorders>
       </w:tblPr>
       <w:tblGrid>
-        <w:gridCol w:w="2400"/>
-        <w:gridCol w:w="700"/>
-        <w:gridCol w:w="4326"/>
-        <w:gridCol w:w="700"/>
-        <w:gridCol w:w="900"/>
+        <w:gridCol w:w="2600"/>
+        <w:gridCol w:w="800"/>
+        <w:gridCol w:w="4826"/>
+        <w:gridCol w:w="800"/>
       </w:tblGrid>
       <w:tr>
         <w:tc>
           <w:tcPr>
-            <w:tcW w:type="dxa" w:w="2400"/>
+            <w:tcW w:type="dxa" w:w="2600"/>
             <w:tcBorders>
               <w:top w:val="single" w:color="CCCCCC" w:sz="4"/>
               <w:left w:val="single" w:color="CCCCCC" w:sz="4"/>
@@ -2284,7 +1902,7 @@
         </w:tc>
         <w:tc>
           <w:tcPr>
-            <w:tcW w:type="dxa" w:w="700"/>
+            <w:tcW w:type="dxa" w:w="800"/>
             <w:tcBorders>
               <w:top w:val="single" w:color="CCCCCC" w:sz="4"/>
               <w:left w:val="single" w:color="CCCCCC" w:sz="4"/>
@@ -2316,7 +1934,7 @@
         </w:tc>
         <w:tc>
           <w:tcPr>
-            <w:tcW w:type="dxa" w:w="4326"/>
+            <w:tcW w:type="dxa" w:w="4826"/>
             <w:tcBorders>
               <w:top w:val="single" w:color="CCCCCC" w:sz="4"/>
               <w:left w:val="single" w:color="CCCCCC" w:sz="4"/>
@@ -2348,7 +1966,7 @@
         </w:tc>
         <w:tc>
           <w:tcPr>
-            <w:tcW w:type="dxa" w:w="700"/>
+            <w:tcW w:type="dxa" w:w="800"/>
             <w:tcBorders>
               <w:top w:val="single" w:color="CCCCCC" w:sz="4"/>
               <w:left w:val="single" w:color="CCCCCC" w:sz="4"/>
@@ -2378,43 +1996,11 @@
             </w:r>
           </w:p>
         </w:tc>
-        <w:tc>
-          <w:tcPr>
-            <w:tcW w:type="dxa" w:w="900"/>
-            <w:tcBorders>
-              <w:top w:val="single" w:color="CCCCCC" w:sz="4"/>
-              <w:left w:val="single" w:color="CCCCCC" w:sz="4"/>
-              <w:bottom w:val="single" w:color="CCCCCC" w:sz="4"/>
-              <w:right w:val="single" w:color="CCCCCC" w:sz="4"/>
-            </w:tcBorders>
-            <w:shd w:fill="004A9F" w:val="clear"/>
-            <w:tcMar>
-              <w:top w:type="dxa" w:w="80"/>
-              <w:left w:type="dxa" w:w="120"/>
-              <w:bottom w:type="dxa" w:w="80"/>
-              <w:right w:type="dxa" w:w="120"/>
-            </w:tcMar>
-            <w:vAlign w:val="center"/>
-          </w:tcPr>
-          <w:p>
-            <w:r>
-              <w:rPr>
-                <w:rFonts w:ascii="Tw Cen MT" w:cs="Tw Cen MT" w:eastAsia="Tw Cen MT" w:hAnsi="Tw Cen MT"/>
-                <w:b/>
-                <w:bCs/>
-                <w:color w:val="FFFFFF"/>
-                <w:sz w:val="20"/>
-                <w:szCs w:val="20"/>
-              </w:rPr>
-              <w:t xml:space="preserve">Statut</w:t>
-            </w:r>
-          </w:p>
-        </w:tc>
       </w:tr>
       <w:tr>
         <w:tc>
           <w:tcPr>
-            <w:tcW w:type="dxa" w:w="2400"/>
+            <w:tcW w:type="dxa" w:w="2600"/>
             <w:tcBorders>
               <w:top w:val="single" w:color="CCCCCC" w:sz="4"/>
               <w:left w:val="single" w:color="CCCCCC" w:sz="4"/>
@@ -2443,7 +2029,7 @@
         </w:tc>
         <w:tc>
           <w:tcPr>
-            <w:tcW w:type="dxa" w:w="700"/>
+            <w:tcW w:type="dxa" w:w="800"/>
             <w:tcBorders>
               <w:top w:val="single" w:color="CCCCCC" w:sz="4"/>
               <w:left w:val="single" w:color="CCCCCC" w:sz="4"/>
@@ -2460,7 +2046,7 @@
             <w:vAlign w:val="center"/>
           </w:tcPr>
           <w:p>
-            <w:hyperlink w:history="1" r:id="rIdpcmbmldzldp83kwlasdzk">
+            <w:hyperlink w:history="1" r:id="rIdor-nlpe03qot7zhmt2rja">
               <w:r>
                 <w:rPr>
                   <w:rFonts w:ascii="Tw Cen MT" w:cs="Tw Cen MT" w:eastAsia="Tw Cen MT" w:hAnsi="Tw Cen MT"/>
@@ -2476,7 +2062,7 @@
         </w:tc>
         <w:tc>
           <w:tcPr>
-            <w:tcW w:type="dxa" w:w="4326"/>
+            <w:tcW w:type="dxa" w:w="4826"/>
             <w:tcBorders>
               <w:top w:val="single" w:color="CCCCCC" w:sz="4"/>
               <w:left w:val="single" w:color="CCCCCC" w:sz="4"/>
@@ -2505,7 +2091,7 @@
         </w:tc>
         <w:tc>
           <w:tcPr>
-            <w:tcW w:type="dxa" w:w="700"/>
+            <w:tcW w:type="dxa" w:w="800"/>
             <w:tcBorders>
               <w:top w:val="single" w:color="CCCCCC" w:sz="4"/>
               <w:left w:val="single" w:color="CCCCCC" w:sz="4"/>
@@ -2522,7 +2108,7 @@
             <w:vAlign w:val="center"/>
           </w:tcPr>
           <w:p>
-            <w:hyperlink w:history="1" r:id="rIdccbwkpf-zjhx4udyqxxes">
+            <w:hyperlink w:history="1" r:id="rIdkbt8tnhxyz4tbttwpevq9">
               <w:r>
                 <w:rPr>
                   <w:rFonts w:ascii="Tw Cen MT" w:cs="Tw Cen MT" w:eastAsia="Tw Cen MT" w:hAnsi="Tw Cen MT"/>
@@ -2534,41 +2120,6 @@
                 <w:t xml:space="preserve">🔊</w:t>
               </w:r>
             </w:hyperlink>
-          </w:p>
-        </w:tc>
-        <w:tc>
-          <w:tcPr>
-            <w:tcW w:type="dxa" w:w="900"/>
-            <w:tcBorders>
-              <w:top w:val="single" w:color="CCCCCC" w:sz="4"/>
-              <w:left w:val="single" w:color="CCCCCC" w:sz="4"/>
-              <w:bottom w:val="single" w:color="CCCCCC" w:sz="4"/>
-              <w:right w:val="single" w:color="CCCCCC" w:sz="4"/>
-            </w:tcBorders>
-            <w:shd w:fill="FFFFFF" w:val="clear"/>
-            <w:tcMar>
-              <w:top w:type="dxa" w:w="80"/>
-              <w:left w:type="dxa" w:w="120"/>
-              <w:bottom w:type="dxa" w:w="80"/>
-              <w:right w:type="dxa" w:w="120"/>
-            </w:tcMar>
-            <w:vAlign w:val="center"/>
-          </w:tcPr>
-          <w:p>
-            <w:pPr>
-              <w:jc w:val="center"/>
-            </w:pPr>
-            <w:r>
-              <w:rPr>
-                <w:rFonts w:ascii="Tw Cen MT" w:cs="Tw Cen MT" w:eastAsia="Tw Cen MT" w:hAnsi="Tw Cen MT"/>
-                <w:b/>
-                <w:bCs/>
-                <w:color w:val="1F7A4D"/>
-                <w:sz w:val="18"/>
-                <w:szCs w:val="18"/>
-              </w:rPr>
-              <w:t xml:space="preserve">✓ OK</w:t>
-            </w:r>
           </w:p>
         </w:tc>
       </w:tr>

</xml_diff>

<commit_message>
Recette 2026-04-20 15:24 — 28 ok / 10 ko
</commit_message>
<xml_diff>
--- a/results/recette-lam.docx
+++ b/results/recette-lam.docx
@@ -339,7 +339,7 @@
                 <w:sz w:val="20"/>
                 <w:szCs w:val="20"/>
               </w:rPr>
-              <w:t xml:space="preserve">20/04/2026 à 12:05:15</w:t>
+              <w:t xml:space="preserve">20/04/2026 à 15:24:47</w:t>
             </w:r>
           </w:p>
         </w:tc>
@@ -566,7 +566,7 @@
             <w:vAlign w:val="center"/>
           </w:tcPr>
           <w:p>
-            <w:hyperlink w:history="1" r:id="rIdfzcy3tg6t4ifztvegashu">
+            <w:hyperlink w:history="1" r:id="rId0hnzoi11sflokv0f6u8u8">
               <w:r>
                 <w:rPr>
                   <w:rFonts w:ascii="Tw Cen MT" w:cs="Tw Cen MT" w:eastAsia="Tw Cen MT" w:hAnsi="Tw Cen MT"/>
@@ -628,7 +628,7 @@
             <w:vAlign w:val="center"/>
           </w:tcPr>
           <w:p>
-            <w:hyperlink w:history="1" r:id="rIdyrvgrc2zatrckx0iovz2l">
+            <w:hyperlink w:history="1" r:id="rIdlkmzucyk_p0gr7ptghpsn">
               <w:r>
                 <w:rPr>
                   <w:rFonts w:ascii="Tw Cen MT" w:cs="Tw Cen MT" w:eastAsia="Tw Cen MT" w:hAnsi="Tw Cen MT"/>
@@ -692,7 +692,7 @@
             <w:vAlign w:val="center"/>
           </w:tcPr>
           <w:p>
-            <w:hyperlink w:history="1" r:id="rIdo_as2gqk1idykvtkanyys">
+            <w:hyperlink w:history="1" r:id="rIdfxlsk0txdzlvbj8a9dmoq">
               <w:r>
                 <w:rPr>
                   <w:rFonts w:ascii="Tw Cen MT" w:cs="Tw Cen MT" w:eastAsia="Tw Cen MT" w:hAnsi="Tw Cen MT"/>
@@ -754,7 +754,7 @@
             <w:vAlign w:val="center"/>
           </w:tcPr>
           <w:p>
-            <w:hyperlink w:history="1" r:id="rId9djkjrp-prhn7qgdpnkem">
+            <w:hyperlink w:history="1" r:id="rId2poz6xbkilr5oxf2k3rzt">
               <w:r>
                 <w:rPr>
                   <w:rFonts w:ascii="Tw Cen MT" w:cs="Tw Cen MT" w:eastAsia="Tw Cen MT" w:hAnsi="Tw Cen MT"/>
@@ -818,7 +818,7 @@
             <w:vAlign w:val="center"/>
           </w:tcPr>
           <w:p>
-            <w:hyperlink w:history="1" r:id="rId68lqpxr1pz9mqvi-g8qem">
+            <w:hyperlink w:history="1" r:id="rIdpn6qcgmv4ky2cicxngy6h">
               <w:r>
                 <w:rPr>
                   <w:rFonts w:ascii="Tw Cen MT" w:cs="Tw Cen MT" w:eastAsia="Tw Cen MT" w:hAnsi="Tw Cen MT"/>
@@ -880,7 +880,7 @@
             <w:vAlign w:val="center"/>
           </w:tcPr>
           <w:p>
-            <w:hyperlink w:history="1" r:id="rIdtym3ocfvcpz7kgl6prrx3">
+            <w:hyperlink w:history="1" r:id="rIdzzjq4qcg16q6uqa7-oda4">
               <w:r>
                 <w:rPr>
                   <w:rFonts w:ascii="Tw Cen MT" w:cs="Tw Cen MT" w:eastAsia="Tw Cen MT" w:hAnsi="Tw Cen MT"/>
@@ -944,7 +944,7 @@
             <w:vAlign w:val="center"/>
           </w:tcPr>
           <w:p>
-            <w:hyperlink w:history="1" r:id="rIdccgnr6wnxs90z_of-v33t">
+            <w:hyperlink w:history="1" r:id="rIdb0omehpvf8s3_ekihjgxa">
               <w:r>
                 <w:rPr>
                   <w:rFonts w:ascii="Tw Cen MT" w:cs="Tw Cen MT" w:eastAsia="Tw Cen MT" w:hAnsi="Tw Cen MT"/>
@@ -1006,7 +1006,7 @@
             <w:vAlign w:val="center"/>
           </w:tcPr>
           <w:p>
-            <w:hyperlink w:history="1" r:id="rIdc-yeazfikskmslj81olml">
+            <w:hyperlink w:history="1" r:id="rId_i0i_b2zcysci4vg4fxbs">
               <w:r>
                 <w:rPr>
                   <w:rFonts w:ascii="Tw Cen MT" w:cs="Tw Cen MT" w:eastAsia="Tw Cen MT" w:hAnsi="Tw Cen MT"/>
@@ -1243,7 +1243,7 @@
             <w:vAlign w:val="center"/>
           </w:tcPr>
           <w:p>
-            <w:hyperlink w:history="1" r:id="rIdb6u-zhxfyvtq_tjcggmp9">
+            <w:hyperlink w:history="1" r:id="rIdxae4e40tzxxxwyrwf_ut7">
               <w:r>
                 <w:rPr>
                   <w:rFonts w:ascii="Tw Cen MT" w:cs="Tw Cen MT" w:eastAsia="Tw Cen MT" w:hAnsi="Tw Cen MT"/>
@@ -1305,7 +1305,7 @@
             <w:vAlign w:val="center"/>
           </w:tcPr>
           <w:p>
-            <w:hyperlink w:history="1" r:id="rIdxb2unvgt8qd_7jpzypcww">
+            <w:hyperlink w:history="1" r:id="rIdlaotnplvjxouevwh1vzzx">
               <w:r>
                 <w:rPr>
                   <w:rFonts w:ascii="Tw Cen MT" w:cs="Tw Cen MT" w:eastAsia="Tw Cen MT" w:hAnsi="Tw Cen MT"/>
@@ -1369,7 +1369,7 @@
             <w:vAlign w:val="center"/>
           </w:tcPr>
           <w:p>
-            <w:hyperlink w:history="1" r:id="rIdw3brnqyhjg1xmhs77chp5">
+            <w:hyperlink w:history="1" r:id="rIdlgafwzuiksvprwhkk-dxz">
               <w:r>
                 <w:rPr>
                   <w:rFonts w:ascii="Tw Cen MT" w:cs="Tw Cen MT" w:eastAsia="Tw Cen MT" w:hAnsi="Tw Cen MT"/>
@@ -1431,7 +1431,7 @@
             <w:vAlign w:val="center"/>
           </w:tcPr>
           <w:p>
-            <w:hyperlink w:history="1" r:id="rIdzzquglevxbgktyyxlkvv5">
+            <w:hyperlink w:history="1" r:id="rId6gilv6b78xwh5ngd3kkrc">
               <w:r>
                 <w:rPr>
                   <w:rFonts w:ascii="Tw Cen MT" w:cs="Tw Cen MT" w:eastAsia="Tw Cen MT" w:hAnsi="Tw Cen MT"/>
@@ -1495,7 +1495,7 @@
             <w:vAlign w:val="center"/>
           </w:tcPr>
           <w:p>
-            <w:hyperlink w:history="1" r:id="rIdpziuw5wasiqtvnfiikz7f">
+            <w:hyperlink w:history="1" r:id="rIdre9srra6anxbzvo9bu3oz">
               <w:r>
                 <w:rPr>
                   <w:rFonts w:ascii="Tw Cen MT" w:cs="Tw Cen MT" w:eastAsia="Tw Cen MT" w:hAnsi="Tw Cen MT"/>
@@ -1557,7 +1557,7 @@
             <w:vAlign w:val="center"/>
           </w:tcPr>
           <w:p>
-            <w:hyperlink w:history="1" r:id="rIdczow00apfiumdmguzqwxk">
+            <w:hyperlink w:history="1" r:id="rIduxduslznrphtlo96vaoxo">
               <w:r>
                 <w:rPr>
                   <w:rFonts w:ascii="Tw Cen MT" w:cs="Tw Cen MT" w:eastAsia="Tw Cen MT" w:hAnsi="Tw Cen MT"/>
@@ -1621,7 +1621,7 @@
             <w:vAlign w:val="center"/>
           </w:tcPr>
           <w:p>
-            <w:hyperlink w:history="1" r:id="rIdtubbkmjcfpgup6d2p-rtj">
+            <w:hyperlink w:history="1" r:id="rIdupy5z5bu58necd4fd7ijv">
               <w:r>
                 <w:rPr>
                   <w:rFonts w:ascii="Tw Cen MT" w:cs="Tw Cen MT" w:eastAsia="Tw Cen MT" w:hAnsi="Tw Cen MT"/>
@@ -1683,7 +1683,7 @@
             <w:vAlign w:val="center"/>
           </w:tcPr>
           <w:p>
-            <w:hyperlink w:history="1" r:id="rIdsl1zi7dfnqawj9-1kfqgd">
+            <w:hyperlink w:history="1" r:id="rIdednm-quun0hub37hd1ddm">
               <w:r>
                 <w:rPr>
                   <w:rFonts w:ascii="Tw Cen MT" w:cs="Tw Cen MT" w:eastAsia="Tw Cen MT" w:hAnsi="Tw Cen MT"/>
@@ -1747,7 +1747,7 @@
             <w:vAlign w:val="center"/>
           </w:tcPr>
           <w:p>
-            <w:hyperlink w:history="1" r:id="rIdwnr5qqzipb9q1ofjybnrl">
+            <w:hyperlink w:history="1" r:id="rIdh95pdsjgq8uebklscnbgs">
               <w:r>
                 <w:rPr>
                   <w:rFonts w:ascii="Tw Cen MT" w:cs="Tw Cen MT" w:eastAsia="Tw Cen MT" w:hAnsi="Tw Cen MT"/>
@@ -1809,7 +1809,7 @@
             <w:vAlign w:val="center"/>
           </w:tcPr>
           <w:p>
-            <w:hyperlink w:history="1" r:id="rId6xgffzljf7ouqbqlbobpq">
+            <w:hyperlink w:history="1" r:id="rId_u7dhmwwmxvra86ytwe8o">
               <w:r>
                 <w:rPr>
                   <w:rFonts w:ascii="Tw Cen MT" w:cs="Tw Cen MT" w:eastAsia="Tw Cen MT" w:hAnsi="Tw Cen MT"/>
@@ -2046,7 +2046,7 @@
             <w:vAlign w:val="center"/>
           </w:tcPr>
           <w:p>
-            <w:hyperlink w:history="1" r:id="rIdor-nlpe03qot7zhmt2rja">
+            <w:hyperlink w:history="1" r:id="rIdqgntgp8xlzucf9cwo-ibx">
               <w:r>
                 <w:rPr>
                   <w:rFonts w:ascii="Tw Cen MT" w:cs="Tw Cen MT" w:eastAsia="Tw Cen MT" w:hAnsi="Tw Cen MT"/>
@@ -2108,7 +2108,7 @@
             <w:vAlign w:val="center"/>
           </w:tcPr>
           <w:p>
-            <w:hyperlink w:history="1" r:id="rIdkbt8tnhxyz4tbttwpevq9">
+            <w:hyperlink w:history="1" r:id="rIdbfa1chvouhm3fwxurymbm">
               <w:r>
                 <w:rPr>
                   <w:rFonts w:ascii="Tw Cen MT" w:cs="Tw Cen MT" w:eastAsia="Tw Cen MT" w:hAnsi="Tw Cen MT"/>

</xml_diff>